<commit_message>
Manuscripts set entirely in Arial (was: serif body + sans tables)
- build_manuscript_template.py: style_font default and Normal -> Arial;
  template docx regenerated to match
- SKILL.md / qc_checklist.md: typography rule now one family throughout
  (body 12 pt double-spaced, tables 9 pt) instead of 'body stays serif'
- workspace builders (knockin / mutagenesis / proteasome) switched to the
  same rule; all three EN manuscripts rebuilt with zero non-Arial runs
</commit_message>
<xml_diff>
--- a/assets/manuscript_template.docx
+++ b/assets/manuscript_template.docx
@@ -271,6 +271,9 @@
         <w:gridCol w:w="1512"/>
       </w:tblGrid>
       <w:tr>
+        <w:trPr>
+          <w:trHeight w:val="453" w:hRule="atLeast"/>
+        </w:trPr>
         <w:tc>
           <w:tcPr>
             <w:tcW w:type="dxa" w:w="1512"/>
@@ -278,6 +281,8 @@
           <w:p>
             <w:pPr>
               <w:pStyle w:val="TableText"/>
+              <w:spacing w:before="40" w:after="80"/>
+              <w:jc w:val="center"/>
             </w:pPr>
             <w:r>
               <w:rPr>
@@ -294,6 +299,8 @@
           <w:p>
             <w:pPr>
               <w:pStyle w:val="TableText"/>
+              <w:spacing w:before="40" w:after="80"/>
+              <w:jc w:val="center"/>
             </w:pPr>
             <w:r>
               <w:rPr>
@@ -310,6 +317,8 @@
           <w:p>
             <w:pPr>
               <w:pStyle w:val="TableText"/>
+              <w:spacing w:before="40" w:after="80"/>
+              <w:jc w:val="center"/>
             </w:pPr>
             <w:r>
               <w:rPr>
@@ -326,6 +335,8 @@
           <w:p>
             <w:pPr>
               <w:pStyle w:val="TableText"/>
+              <w:spacing w:before="40" w:after="80"/>
+              <w:jc w:val="center"/>
             </w:pPr>
             <w:r>
               <w:rPr>
@@ -342,6 +353,8 @@
           <w:p>
             <w:pPr>
               <w:pStyle w:val="TableText"/>
+              <w:spacing w:before="40" w:after="80"/>
+              <w:jc w:val="center"/>
             </w:pPr>
             <w:r>
               <w:rPr>
@@ -358,6 +371,8 @@
           <w:p>
             <w:pPr>
               <w:pStyle w:val="TableText"/>
+              <w:spacing w:before="40" w:after="80"/>
+              <w:jc w:val="center"/>
             </w:pPr>
             <w:r>
               <w:rPr>
@@ -376,6 +391,7 @@
           <w:p>
             <w:pPr>
               <w:pStyle w:val="TableText"/>
+              <w:jc w:val="center"/>
             </w:pPr>
             <w:r>
               <w:t>{{company}}</w:t>
@@ -389,6 +405,7 @@
           <w:p>
             <w:pPr>
               <w:pStyle w:val="TableText"/>
+              <w:jc w:val="center"/>
             </w:pPr>
             <w:r>
               <w:t>{{program}}</w:t>
@@ -402,6 +419,7 @@
           <w:p>
             <w:pPr>
               <w:pStyle w:val="TableText"/>
+              <w:jc w:val="center"/>
             </w:pPr>
             <w:r>
               <w:t>{{target}}</w:t>
@@ -415,6 +433,7 @@
           <w:p>
             <w:pPr>
               <w:pStyle w:val="TableText"/>
+              <w:jc w:val="center"/>
             </w:pPr>
             <w:r>
               <w:t>{{stage}}</w:t>
@@ -428,6 +447,7 @@
           <w:p>
             <w:pPr>
               <w:pStyle w:val="TableText"/>
+              <w:jc w:val="center"/>
             </w:pPr>
             <w:r>
               <w:t>{{indication}}</w:t>
@@ -441,6 +461,7 @@
           <w:p>
             <w:pPr>
               <w:pStyle w:val="TableText"/>
+              <w:jc w:val="left"/>
             </w:pPr>
             <w:r>
               <w:t>{{NCT / disclosure + date}}</w:t>
@@ -456,6 +477,7 @@
           <w:p>
             <w:pPr>
               <w:pStyle w:val="TableText"/>
+              <w:jc w:val="center"/>
             </w:pPr>
             <w:r>
               <w:t>{{company}}</w:t>
@@ -469,6 +491,7 @@
           <w:p>
             <w:pPr>
               <w:pStyle w:val="TableText"/>
+              <w:jc w:val="center"/>
             </w:pPr>
             <w:r>
               <w:t>{{program}}</w:t>
@@ -482,6 +505,7 @@
           <w:p>
             <w:pPr>
               <w:pStyle w:val="TableText"/>
+              <w:jc w:val="center"/>
             </w:pPr>
             <w:r>
               <w:t>{{target}}</w:t>
@@ -495,6 +519,7 @@
           <w:p>
             <w:pPr>
               <w:pStyle w:val="TableText"/>
+              <w:jc w:val="center"/>
             </w:pPr>
             <w:r>
               <w:t>{{stage}}</w:t>
@@ -508,6 +533,7 @@
           <w:p>
             <w:pPr>
               <w:pStyle w:val="TableText"/>
+              <w:jc w:val="center"/>
             </w:pPr>
             <w:r>
               <w:t>{{indication}}</w:t>
@@ -521,6 +547,7 @@
           <w:p>
             <w:pPr>
               <w:pStyle w:val="TableText"/>
+              <w:jc w:val="left"/>
             </w:pPr>
             <w:r>
               <w:t>{{NCT / disclosure + date}}</w:t>
@@ -906,7 +933,7 @@
       <w:spacing w:line="480" w:lineRule="auto" w:after="0"/>
     </w:pPr>
     <w:rPr>
-      <w:rFonts w:ascii="Times New Roman" w:hAnsi="Times New Roman" w:eastAsia="SimSun"/>
+      <w:rFonts w:ascii="Arial" w:hAnsi="Arial" w:eastAsia="SimSun"/>
       <w:b w:val="0"/>
       <w:i w:val="0"/>
       <w:color w:val="000000"/>
@@ -12603,7 +12630,7 @@
       <w:jc w:val="center"/>
     </w:pPr>
     <w:rPr>
-      <w:rFonts w:ascii="Times New Roman" w:hAnsi="Times New Roman" w:eastAsia="SimSun"/>
+      <w:rFonts w:ascii="Arial" w:hAnsi="Arial" w:eastAsia="SimSun"/>
       <w:b/>
       <w:i w:val="0"/>
       <w:color w:val="000000"/>
@@ -12618,7 +12645,7 @@
       <w:jc w:val="center"/>
     </w:pPr>
     <w:rPr>
-      <w:rFonts w:ascii="Times New Roman" w:hAnsi="Times New Roman" w:eastAsia="SimSun"/>
+      <w:rFonts w:ascii="Arial" w:hAnsi="Arial" w:eastAsia="SimSun"/>
       <w:b w:val="0"/>
       <w:i/>
       <w:color w:val="000000"/>
@@ -12633,7 +12660,7 @@
       <w:jc w:val="center"/>
     </w:pPr>
     <w:rPr>
-      <w:rFonts w:ascii="Times New Roman" w:hAnsi="Times New Roman" w:eastAsia="SimSun"/>
+      <w:rFonts w:ascii="Arial" w:hAnsi="Arial" w:eastAsia="SimSun"/>
       <w:b w:val="0"/>
       <w:i w:val="0"/>
       <w:color w:val="000000"/>
@@ -12648,7 +12675,7 @@
       <w:spacing w:before="360" w:after="120"/>
     </w:pPr>
     <w:rPr>
-      <w:rFonts w:ascii="Times New Roman" w:hAnsi="Times New Roman" w:eastAsia="SimSun"/>
+      <w:rFonts w:ascii="Arial" w:hAnsi="Arial" w:eastAsia="SimSun"/>
       <w:b/>
       <w:i w:val="0"/>
       <w:color w:val="000000"/>
@@ -12663,7 +12690,7 @@
       <w:spacing w:before="240" w:after="120"/>
     </w:pPr>
     <w:rPr>
-      <w:rFonts w:ascii="Times New Roman" w:hAnsi="Times New Roman" w:eastAsia="SimSun"/>
+      <w:rFonts w:ascii="Arial" w:hAnsi="Arial" w:eastAsia="SimSun"/>
       <w:b/>
       <w:i/>
       <w:color w:val="000000"/>
@@ -12678,7 +12705,7 @@
       <w:ind w:left="567" w:right="567"/>
     </w:pPr>
     <w:rPr>
-      <w:rFonts w:ascii="Times New Roman" w:hAnsi="Times New Roman" w:eastAsia="SimSun"/>
+      <w:rFonts w:ascii="Arial" w:hAnsi="Arial" w:eastAsia="SimSun"/>
       <w:b w:val="0"/>
       <w:i w:val="0"/>
       <w:color w:val="000000"/>
@@ -12693,7 +12720,7 @@
       <w:spacing w:line="240" w:lineRule="auto" w:before="200"/>
     </w:pPr>
     <w:rPr>
-      <w:rFonts w:ascii="Times New Roman" w:hAnsi="Times New Roman" w:eastAsia="SimSun"/>
+      <w:rFonts w:ascii="Arial" w:hAnsi="Arial" w:eastAsia="SimSun"/>
       <w:b/>
       <w:i w:val="0"/>
       <w:color w:val="000000"/>
@@ -12707,42 +12734,72 @@
       <w:spacing w:line="240" w:lineRule="auto" w:after="200"/>
     </w:pPr>
     <w:rPr>
-      <w:rFonts w:ascii="Times New Roman" w:hAnsi="Times New Roman" w:eastAsia="SimSun"/>
+      <w:rFonts w:ascii="Arial" w:hAnsi="Arial" w:eastAsia="SimSun"/>
       <w:b w:val="0"/>
       <w:i w:val="0"/>
       <w:color w:val="000000"/>
       <w:sz w:val="18"/>
     </w:rPr>
   </w:style>
-  <w:style w:type="paragraph" w:customStyle="1" w:styleId="TableText">
-    <w:name w:val="TableText"/>
+  <w:style w:type="paragraph" w:customStyle="1" w:styleId="FigCaption">
+    <w:name w:val="FigCaption"/>
     <w:basedOn w:val="Normal"/>
     <w:pPr>
-      <w:spacing w:line="240" w:lineRule="auto"/>
+      <w:keepNext/>
+      <w:spacing w:line="240" w:lineRule="auto" w:before="240"/>
     </w:pPr>
     <w:rPr>
-      <w:rFonts w:ascii="Times New Roman" w:hAnsi="Times New Roman" w:eastAsia="SimSun"/>
-      <w:b w:val="0"/>
+      <w:rFonts w:ascii="Arial" w:hAnsi="Arial" w:eastAsia="SimSun"/>
+      <w:b/>
       <w:i w:val="0"/>
       <w:color w:val="000000"/>
       <w:sz w:val="20"/>
     </w:rPr>
   </w:style>
-  <w:style w:type="paragraph" w:customStyle="1" w:styleId="ReferenceEntry">
-    <w:name w:val="ReferenceEntry"/>
+  <w:style w:type="paragraph" w:customStyle="1" w:styleId="FigurePara">
+    <w:name w:val="FigurePara"/>
     <w:basedOn w:val="Normal"/>
     <w:pPr>
-      <w:spacing w:line="240" w:lineRule="auto" w:after="120"/>
-      <w:ind w:hanging="567" w:left="567"/>
+      <w:keepNext/>
+      <w:spacing w:line="240" w:lineRule="auto" w:after="240"/>
     </w:pPr>
     <w:rPr>
-      <w:rFonts w:ascii="Times New Roman" w:hAnsi="Times New Roman" w:eastAsia="SimSun"/>
+      <w:rFonts w:ascii="Arial" w:hAnsi="Arial" w:eastAsia="SimSun"/>
       <w:b w:val="0"/>
       <w:i w:val="0"/>
       <w:color w:val="000000"/>
       <w:sz w:val="24"/>
     </w:rPr>
   </w:style>
+  <w:style w:type="paragraph" w:customStyle="1" w:styleId="TableText">
+    <w:name w:val="TableText"/>
+    <w:basedOn w:val="Normal"/>
+    <w:pPr>
+      <w:spacing w:line="240" w:lineRule="auto" w:before="100" w:after="100"/>
+    </w:pPr>
+    <w:rPr>
+      <w:rFonts w:ascii="Arial" w:hAnsi="Arial" w:eastAsia="SimSun"/>
+      <w:b w:val="0"/>
+      <w:i w:val="0"/>
+      <w:color w:val="000000"/>
+      <w:sz w:val="18"/>
+    </w:rPr>
+  </w:style>
+  <w:style w:type="paragraph" w:customStyle="1" w:styleId="ReferenceEntry">
+    <w:name w:val="ReferenceEntry"/>
+    <w:basedOn w:val="Normal"/>
+    <w:pPr>
+      <w:spacing w:line="240" w:lineRule="auto" w:after="120"/>
+      <w:ind w:hanging="567" w:left="567"/>
+    </w:pPr>
+    <w:rPr>
+      <w:rFonts w:ascii="Arial" w:hAnsi="Arial" w:eastAsia="SimSun"/>
+      <w:b w:val="0"/>
+      <w:i w:val="0"/>
+      <w:color w:val="000000"/>
+      <w:sz w:val="24"/>
+    </w:rPr>
+  </w:style>
   <w:style w:type="paragraph" w:customStyle="1" w:styleId="KeyPoint">
     <w:name w:val="KeyPoint"/>
     <w:basedOn w:val="Normal"/>
@@ -12751,7 +12808,7 @@
       <w:ind w:left="567"/>
     </w:pPr>
     <w:rPr>
-      <w:rFonts w:ascii="Times New Roman" w:hAnsi="Times New Roman" w:eastAsia="SimSun"/>
+      <w:rFonts w:ascii="Arial" w:hAnsi="Arial" w:eastAsia="SimSun"/>
       <w:b w:val="0"/>
       <w:i/>
       <w:color w:val="000000"/>

</xml_diff>